<commit_message>
Conference report template: updated Word file
Co-Authored-By: Claude Fable 5 <noreply@anthropic.com>
</commit_message>
<xml_diff>
--- a/homework/conference-report.docx
+++ b/homework/conference-report.docx
@@ -112,13 +112,6 @@
       <w:r>
         <w:tab/>
       </w:r>
-      <w:r>
-        <w:rPr>
-          <w:color w:val="6E6E6E"/>
-          <w:sz w:val="18"/>
-        </w:rPr>
-        <w:t>2–3 sentences</w:t>
-      </w:r>
     </w:p>
     <w:p>
       <w:pPr>
@@ -191,13 +184,6 @@
       </w:r>
       <w:r>
         <w:tab/>
-      </w:r>
-      <w:r>
-        <w:rPr>
-          <w:color w:val="6E6E6E"/>
-          <w:sz w:val="18"/>
-        </w:rPr>
-        <w:t>the core of the report</w:t>
       </w:r>
     </w:p>
     <w:p>
@@ -492,13 +478,6 @@
       <w:r>
         <w:tab/>
       </w:r>
-      <w:r>
-        <w:rPr>
-          <w:color w:val="6E6E6E"/>
-          <w:sz w:val="18"/>
-        </w:rPr>
-        <w:t>4–6 sentences</w:t>
-      </w:r>
     </w:p>
     <w:p>
       <w:pPr>
@@ -750,133 +729,133 @@
     <w:lsdException w:name="heading 7" w:uiPriority="9" w:qFormat="1"/>
     <w:lsdException w:name="heading 8" w:uiPriority="9" w:qFormat="1"/>
     <w:lsdException w:name="heading 9" w:uiPriority="9" w:qFormat="1"/>
-    <w:lsdException w:name="toc 1" w:uiPriority="57"/>
-    <w:lsdException w:name="toc 2" w:uiPriority="57"/>
-    <w:lsdException w:name="toc 3" w:uiPriority="57"/>
-    <w:lsdException w:name="toc 4" w:uiPriority="57"/>
-    <w:lsdException w:name="toc 5" w:uiPriority="57"/>
-    <w:lsdException w:name="toc 6" w:uiPriority="57"/>
-    <w:lsdException w:name="toc 7" w:uiPriority="57"/>
-    <w:lsdException w:name="toc 8" w:uiPriority="57"/>
-    <w:lsdException w:name="toc 9" w:uiPriority="57"/>
-    <w:lsdException w:name="caption" w:uiPriority="53" w:qFormat="1"/>
-    <w:lsdException w:name="Title" w:semiHidden="0" w:uiPriority="16" w:unhideWhenUsed="0" w:qFormat="1"/>
+    <w:lsdException w:name="toc 1" w:uiPriority="87"/>
+    <w:lsdException w:name="toc 2" w:uiPriority="87"/>
+    <w:lsdException w:name="toc 3" w:uiPriority="87"/>
+    <w:lsdException w:name="toc 4" w:uiPriority="87"/>
+    <w:lsdException w:name="toc 5" w:uiPriority="87"/>
+    <w:lsdException w:name="toc 6" w:uiPriority="87"/>
+    <w:lsdException w:name="toc 7" w:uiPriority="87"/>
+    <w:lsdException w:name="toc 8" w:uiPriority="87"/>
+    <w:lsdException w:name="toc 9" w:uiPriority="87"/>
+    <w:lsdException w:name="caption" w:uiPriority="83" w:qFormat="1"/>
+    <w:lsdException w:name="Title" w:semiHidden="0" w:uiPriority="22" w:unhideWhenUsed="0" w:qFormat="1"/>
     <w:lsdException w:name="Default Paragraph Font" w:uiPriority="1"/>
-    <w:lsdException w:name="Subtitle" w:semiHidden="0" w:uiPriority="17" w:unhideWhenUsed="0" w:qFormat="1"/>
-    <w:lsdException w:name="Strong" w:semiHidden="0" w:uiPriority="34" w:unhideWhenUsed="0" w:qFormat="1"/>
-    <w:lsdException w:name="Emphasis" w:semiHidden="0" w:uiPriority="32" w:unhideWhenUsed="0" w:qFormat="1"/>
-    <w:lsdException w:name="Table Grid" w:semiHidden="0" w:uiPriority="89" w:unhideWhenUsed="0"/>
+    <w:lsdException w:name="Subtitle" w:semiHidden="0" w:uiPriority="23" w:unhideWhenUsed="0" w:qFormat="1"/>
+    <w:lsdException w:name="Strong" w:semiHidden="0" w:uiPriority="52" w:unhideWhenUsed="0" w:qFormat="1"/>
+    <w:lsdException w:name="Emphasis" w:semiHidden="0" w:uiPriority="50" w:unhideWhenUsed="0" w:qFormat="1"/>
+    <w:lsdException w:name="Table Grid" w:semiHidden="0" w:uiPriority="137" w:unhideWhenUsed="0"/>
     <w:lsdException w:name="Placeholder Text" w:unhideWhenUsed="0"/>
     <w:lsdException w:name="No Spacing" w:semiHidden="0" w:uiPriority="1" w:unhideWhenUsed="0" w:qFormat="1"/>
-    <w:lsdException w:name="Light Shading" w:semiHidden="0" w:uiPriority="96" w:unhideWhenUsed="0"/>
-    <w:lsdException w:name="Light List" w:semiHidden="0" w:uiPriority="97" w:unhideWhenUsed="0"/>
-    <w:lsdException w:name="Light Grid" w:semiHidden="0" w:uiPriority="98" w:unhideWhenUsed="0"/>
-    <w:lsdException w:name="Medium Shading 1" w:semiHidden="0" w:uiPriority="99" w:unhideWhenUsed="0"/>
-    <w:lsdException w:name="Medium Shading 2" w:semiHidden="0" w:uiPriority="100" w:unhideWhenUsed="0"/>
-    <w:lsdException w:name="Medium List 1" w:semiHidden="0" w:uiPriority="101" w:unhideWhenUsed="0"/>
-    <w:lsdException w:name="Medium List 2" w:semiHidden="0" w:uiPriority="102" w:unhideWhenUsed="0"/>
-    <w:lsdException w:name="Medium Grid 1" w:semiHidden="0" w:uiPriority="103" w:unhideWhenUsed="0"/>
-    <w:lsdException w:name="Medium Grid 2" w:semiHidden="0" w:uiPriority="104" w:unhideWhenUsed="0"/>
-    <w:lsdException w:name="Medium Grid 3" w:semiHidden="0" w:uiPriority="105" w:unhideWhenUsed="0"/>
-    <w:lsdException w:name="Dark List" w:semiHidden="0" w:uiPriority="112" w:unhideWhenUsed="0"/>
-    <w:lsdException w:name="Colorful Shading" w:semiHidden="0" w:uiPriority="113" w:unhideWhenUsed="0"/>
-    <w:lsdException w:name="Colorful List" w:semiHidden="0" w:uiPriority="114" w:unhideWhenUsed="0"/>
-    <w:lsdException w:name="Colorful Grid" w:semiHidden="0" w:uiPriority="115" w:unhideWhenUsed="0"/>
-    <w:lsdException w:name="Light Shading Accent 1" w:semiHidden="0" w:uiPriority="96" w:unhideWhenUsed="0"/>
-    <w:lsdException w:name="Light List Accent 1" w:semiHidden="0" w:uiPriority="97" w:unhideWhenUsed="0"/>
-    <w:lsdException w:name="Light Grid Accent 1" w:semiHidden="0" w:uiPriority="98" w:unhideWhenUsed="0"/>
-    <w:lsdException w:name="Medium Shading 1 Accent 1" w:semiHidden="0" w:uiPriority="99" w:unhideWhenUsed="0"/>
-    <w:lsdException w:name="Medium Shading 2 Accent 1" w:semiHidden="0" w:uiPriority="100" w:unhideWhenUsed="0"/>
-    <w:lsdException w:name="Medium List 1 Accent 1" w:semiHidden="0" w:uiPriority="101" w:unhideWhenUsed="0"/>
+    <w:lsdException w:name="Light Shading" w:semiHidden="0" w:uiPriority="150" w:unhideWhenUsed="0"/>
+    <w:lsdException w:name="Light List" w:semiHidden="0" w:uiPriority="151" w:unhideWhenUsed="0"/>
+    <w:lsdException w:name="Light Grid" w:semiHidden="0" w:uiPriority="152" w:unhideWhenUsed="0"/>
+    <w:lsdException w:name="Medium Shading 1" w:semiHidden="0" w:uiPriority="153" w:unhideWhenUsed="0"/>
+    <w:lsdException w:name="Medium Shading 2" w:semiHidden="0" w:uiPriority="256" w:unhideWhenUsed="0"/>
+    <w:lsdException w:name="Medium List 1" w:semiHidden="0" w:uiPriority="257" w:unhideWhenUsed="0"/>
+    <w:lsdException w:name="Medium List 2" w:semiHidden="0" w:uiPriority="258" w:unhideWhenUsed="0"/>
+    <w:lsdException w:name="Medium Grid 1" w:semiHidden="0" w:uiPriority="259" w:unhideWhenUsed="0"/>
+    <w:lsdException w:name="Medium Grid 2" w:semiHidden="0" w:uiPriority="260" w:unhideWhenUsed="0"/>
+    <w:lsdException w:name="Medium Grid 3" w:semiHidden="0" w:uiPriority="261" w:unhideWhenUsed="0"/>
+    <w:lsdException w:name="Dark List" w:semiHidden="0" w:uiPriority="274" w:unhideWhenUsed="0"/>
+    <w:lsdException w:name="Colorful Shading" w:semiHidden="0" w:uiPriority="275" w:unhideWhenUsed="0"/>
+    <w:lsdException w:name="Colorful List" w:semiHidden="0" w:uiPriority="276" w:unhideWhenUsed="0"/>
+    <w:lsdException w:name="Colorful Grid" w:semiHidden="0" w:uiPriority="277" w:unhideWhenUsed="0"/>
+    <w:lsdException w:name="Light Shading Accent 1" w:semiHidden="0" w:uiPriority="150" w:unhideWhenUsed="0"/>
+    <w:lsdException w:name="Light List Accent 1" w:semiHidden="0" w:uiPriority="151" w:unhideWhenUsed="0"/>
+    <w:lsdException w:name="Light Grid Accent 1" w:semiHidden="0" w:uiPriority="152" w:unhideWhenUsed="0"/>
+    <w:lsdException w:name="Medium Shading 1 Accent 1" w:semiHidden="0" w:uiPriority="153" w:unhideWhenUsed="0"/>
+    <w:lsdException w:name="Medium Shading 2 Accent 1" w:semiHidden="0" w:uiPriority="256" w:unhideWhenUsed="0"/>
+    <w:lsdException w:name="Medium List 1 Accent 1" w:semiHidden="0" w:uiPriority="257" w:unhideWhenUsed="0"/>
     <w:lsdException w:name="Revision" w:unhideWhenUsed="0"/>
-    <w:lsdException w:name="List Paragraph" w:semiHidden="0" w:uiPriority="52" w:unhideWhenUsed="0" w:qFormat="1"/>
-    <w:lsdException w:name="Quote" w:semiHidden="0" w:uiPriority="41" w:unhideWhenUsed="0" w:qFormat="1"/>
-    <w:lsdException w:name="Intense Quote" w:semiHidden="0" w:uiPriority="48" w:unhideWhenUsed="0" w:qFormat="1"/>
-    <w:lsdException w:name="Medium List 2 Accent 1" w:semiHidden="0" w:uiPriority="102" w:unhideWhenUsed="0"/>
-    <w:lsdException w:name="Medium Grid 1 Accent 1" w:semiHidden="0" w:uiPriority="103" w:unhideWhenUsed="0"/>
-    <w:lsdException w:name="Medium Grid 2 Accent 1" w:semiHidden="0" w:uiPriority="104" w:unhideWhenUsed="0"/>
-    <w:lsdException w:name="Medium Grid 3 Accent 1" w:semiHidden="0" w:uiPriority="105" w:unhideWhenUsed="0"/>
-    <w:lsdException w:name="Dark List Accent 1" w:semiHidden="0" w:uiPriority="112" w:unhideWhenUsed="0"/>
-    <w:lsdException w:name="Colorful Shading Accent 1" w:semiHidden="0" w:uiPriority="113" w:unhideWhenUsed="0"/>
-    <w:lsdException w:name="Colorful List Accent 1" w:semiHidden="0" w:uiPriority="114" w:unhideWhenUsed="0"/>
-    <w:lsdException w:name="Colorful Grid Accent 1" w:semiHidden="0" w:uiPriority="115" w:unhideWhenUsed="0"/>
-    <w:lsdException w:name="Light Shading Accent 2" w:semiHidden="0" w:uiPriority="96" w:unhideWhenUsed="0"/>
-    <w:lsdException w:name="Light List Accent 2" w:semiHidden="0" w:uiPriority="97" w:unhideWhenUsed="0"/>
-    <w:lsdException w:name="Light Grid Accent 2" w:semiHidden="0" w:uiPriority="98" w:unhideWhenUsed="0"/>
-    <w:lsdException w:name="Medium Shading 1 Accent 2" w:semiHidden="0" w:uiPriority="99" w:unhideWhenUsed="0"/>
-    <w:lsdException w:name="Medium Shading 2 Accent 2" w:semiHidden="0" w:uiPriority="100" w:unhideWhenUsed="0"/>
-    <w:lsdException w:name="Medium List 1 Accent 2" w:semiHidden="0" w:uiPriority="101" w:unhideWhenUsed="0"/>
-    <w:lsdException w:name="Medium List 2 Accent 2" w:semiHidden="0" w:uiPriority="102" w:unhideWhenUsed="0"/>
-    <w:lsdException w:name="Medium Grid 1 Accent 2" w:semiHidden="0" w:uiPriority="103" w:unhideWhenUsed="0"/>
-    <w:lsdException w:name="Medium Grid 2 Accent 2" w:semiHidden="0" w:uiPriority="104" w:unhideWhenUsed="0"/>
-    <w:lsdException w:name="Medium Grid 3 Accent 2" w:semiHidden="0" w:uiPriority="105" w:unhideWhenUsed="0"/>
-    <w:lsdException w:name="Dark List Accent 2" w:semiHidden="0" w:uiPriority="112" w:unhideWhenUsed="0"/>
-    <w:lsdException w:name="Colorful Shading Accent 2" w:semiHidden="0" w:uiPriority="113" w:unhideWhenUsed="0"/>
-    <w:lsdException w:name="Colorful List Accent 2" w:semiHidden="0" w:uiPriority="114" w:unhideWhenUsed="0"/>
-    <w:lsdException w:name="Colorful Grid Accent 2" w:semiHidden="0" w:uiPriority="115" w:unhideWhenUsed="0"/>
-    <w:lsdException w:name="Light Shading Accent 3" w:semiHidden="0" w:uiPriority="96" w:unhideWhenUsed="0"/>
-    <w:lsdException w:name="Light List Accent 3" w:semiHidden="0" w:uiPriority="97" w:unhideWhenUsed="0"/>
-    <w:lsdException w:name="Light Grid Accent 3" w:semiHidden="0" w:uiPriority="98" w:unhideWhenUsed="0"/>
-    <w:lsdException w:name="Medium Shading 1 Accent 3" w:semiHidden="0" w:uiPriority="99" w:unhideWhenUsed="0"/>
-    <w:lsdException w:name="Medium Shading 2 Accent 3" w:semiHidden="0" w:uiPriority="100" w:unhideWhenUsed="0"/>
-    <w:lsdException w:name="Medium List 1 Accent 3" w:semiHidden="0" w:uiPriority="101" w:unhideWhenUsed="0"/>
-    <w:lsdException w:name="Medium List 2 Accent 3" w:semiHidden="0" w:uiPriority="102" w:unhideWhenUsed="0"/>
-    <w:lsdException w:name="Medium Grid 1 Accent 3" w:semiHidden="0" w:uiPriority="103" w:unhideWhenUsed="0"/>
-    <w:lsdException w:name="Medium Grid 2 Accent 3" w:semiHidden="0" w:uiPriority="104" w:unhideWhenUsed="0"/>
-    <w:lsdException w:name="Medium Grid 3 Accent 3" w:semiHidden="0" w:uiPriority="105" w:unhideWhenUsed="0"/>
-    <w:lsdException w:name="Dark List Accent 3" w:semiHidden="0" w:uiPriority="112" w:unhideWhenUsed="0"/>
-    <w:lsdException w:name="Colorful Shading Accent 3" w:semiHidden="0" w:uiPriority="113" w:unhideWhenUsed="0"/>
-    <w:lsdException w:name="Colorful List Accent 3" w:semiHidden="0" w:uiPriority="114" w:unhideWhenUsed="0"/>
-    <w:lsdException w:name="Colorful Grid Accent 3" w:semiHidden="0" w:uiPriority="115" w:unhideWhenUsed="0"/>
-    <w:lsdException w:name="Light Shading Accent 4" w:semiHidden="0" w:uiPriority="96" w:unhideWhenUsed="0"/>
-    <w:lsdException w:name="Light List Accent 4" w:semiHidden="0" w:uiPriority="97" w:unhideWhenUsed="0"/>
-    <w:lsdException w:name="Light Grid Accent 4" w:semiHidden="0" w:uiPriority="98" w:unhideWhenUsed="0"/>
-    <w:lsdException w:name="Medium Shading 1 Accent 4" w:semiHidden="0" w:uiPriority="99" w:unhideWhenUsed="0"/>
-    <w:lsdException w:name="Medium Shading 2 Accent 4" w:semiHidden="0" w:uiPriority="100" w:unhideWhenUsed="0"/>
-    <w:lsdException w:name="Medium List 1 Accent 4" w:semiHidden="0" w:uiPriority="101" w:unhideWhenUsed="0"/>
-    <w:lsdException w:name="Medium List 2 Accent 4" w:semiHidden="0" w:uiPriority="102" w:unhideWhenUsed="0"/>
-    <w:lsdException w:name="Medium Grid 1 Accent 4" w:semiHidden="0" w:uiPriority="103" w:unhideWhenUsed="0"/>
-    <w:lsdException w:name="Medium Grid 2 Accent 4" w:semiHidden="0" w:uiPriority="104" w:unhideWhenUsed="0"/>
-    <w:lsdException w:name="Medium Grid 3 Accent 4" w:semiHidden="0" w:uiPriority="105" w:unhideWhenUsed="0"/>
-    <w:lsdException w:name="Dark List Accent 4" w:semiHidden="0" w:uiPriority="112" w:unhideWhenUsed="0"/>
-    <w:lsdException w:name="Colorful Shading Accent 4" w:semiHidden="0" w:uiPriority="113" w:unhideWhenUsed="0"/>
-    <w:lsdException w:name="Colorful List Accent 4" w:semiHidden="0" w:uiPriority="114" w:unhideWhenUsed="0"/>
-    <w:lsdException w:name="Colorful Grid Accent 4" w:semiHidden="0" w:uiPriority="115" w:unhideWhenUsed="0"/>
-    <w:lsdException w:name="Light Shading Accent 5" w:semiHidden="0" w:uiPriority="96" w:unhideWhenUsed="0"/>
-    <w:lsdException w:name="Light List Accent 5" w:semiHidden="0" w:uiPriority="97" w:unhideWhenUsed="0"/>
-    <w:lsdException w:name="Light Grid Accent 5" w:semiHidden="0" w:uiPriority="98" w:unhideWhenUsed="0"/>
-    <w:lsdException w:name="Medium Shading 1 Accent 5" w:semiHidden="0" w:uiPriority="99" w:unhideWhenUsed="0"/>
-    <w:lsdException w:name="Medium Shading 2 Accent 5" w:semiHidden="0" w:uiPriority="100" w:unhideWhenUsed="0"/>
-    <w:lsdException w:name="Medium List 1 Accent 5" w:semiHidden="0" w:uiPriority="101" w:unhideWhenUsed="0"/>
-    <w:lsdException w:name="Medium List 2 Accent 5" w:semiHidden="0" w:uiPriority="102" w:unhideWhenUsed="0"/>
-    <w:lsdException w:name="Medium Grid 1 Accent 5" w:semiHidden="0" w:uiPriority="103" w:unhideWhenUsed="0"/>
-    <w:lsdException w:name="Medium Grid 2 Accent 5" w:semiHidden="0" w:uiPriority="104" w:unhideWhenUsed="0"/>
-    <w:lsdException w:name="Medium Grid 3 Accent 5" w:semiHidden="0" w:uiPriority="105" w:unhideWhenUsed="0"/>
-    <w:lsdException w:name="Dark List Accent 5" w:semiHidden="0" w:uiPriority="112" w:unhideWhenUsed="0"/>
-    <w:lsdException w:name="Colorful Shading Accent 5" w:semiHidden="0" w:uiPriority="113" w:unhideWhenUsed="0"/>
-    <w:lsdException w:name="Colorful List Accent 5" w:semiHidden="0" w:uiPriority="114" w:unhideWhenUsed="0"/>
-    <w:lsdException w:name="Colorful Grid Accent 5" w:semiHidden="0" w:uiPriority="115" w:unhideWhenUsed="0"/>
-    <w:lsdException w:name="Light Shading Accent 6" w:semiHidden="0" w:uiPriority="96" w:unhideWhenUsed="0"/>
-    <w:lsdException w:name="Light List Accent 6" w:semiHidden="0" w:uiPriority="97" w:unhideWhenUsed="0"/>
-    <w:lsdException w:name="Light Grid Accent 6" w:semiHidden="0" w:uiPriority="98" w:unhideWhenUsed="0"/>
-    <w:lsdException w:name="Medium Shading 1 Accent 6" w:semiHidden="0" w:uiPriority="99" w:unhideWhenUsed="0"/>
-    <w:lsdException w:name="Medium Shading 2 Accent 6" w:semiHidden="0" w:uiPriority="100" w:unhideWhenUsed="0"/>
-    <w:lsdException w:name="Medium List 1 Accent 6" w:semiHidden="0" w:uiPriority="101" w:unhideWhenUsed="0"/>
-    <w:lsdException w:name="Medium List 2 Accent 6" w:semiHidden="0" w:uiPriority="102" w:unhideWhenUsed="0"/>
-    <w:lsdException w:name="Medium Grid 1 Accent 6" w:semiHidden="0" w:uiPriority="103" w:unhideWhenUsed="0"/>
-    <w:lsdException w:name="Medium Grid 2 Accent 6" w:semiHidden="0" w:uiPriority="104" w:unhideWhenUsed="0"/>
-    <w:lsdException w:name="Medium Grid 3 Accent 6" w:semiHidden="0" w:uiPriority="105" w:unhideWhenUsed="0"/>
-    <w:lsdException w:name="Dark List Accent 6" w:semiHidden="0" w:uiPriority="112" w:unhideWhenUsed="0"/>
-    <w:lsdException w:name="Colorful Shading Accent 6" w:semiHidden="0" w:uiPriority="113" w:unhideWhenUsed="0"/>
-    <w:lsdException w:name="Colorful List Accent 6" w:semiHidden="0" w:uiPriority="114" w:unhideWhenUsed="0"/>
-    <w:lsdException w:name="Colorful Grid Accent 6" w:semiHidden="0" w:uiPriority="115" w:unhideWhenUsed="0"/>
-    <w:lsdException w:name="Subtle Emphasis" w:semiHidden="0" w:uiPriority="25" w:unhideWhenUsed="0" w:qFormat="1"/>
-    <w:lsdException w:name="Intense Emphasis" w:semiHidden="0" w:uiPriority="33" w:unhideWhenUsed="0" w:qFormat="1"/>
-    <w:lsdException w:name="Subtle Reference" w:semiHidden="0" w:uiPriority="49" w:unhideWhenUsed="0" w:qFormat="1"/>
-    <w:lsdException w:name="Intense Reference" w:semiHidden="0" w:uiPriority="50" w:unhideWhenUsed="0" w:qFormat="1"/>
-    <w:lsdException w:name="Book Title" w:semiHidden="0" w:uiPriority="51" w:unhideWhenUsed="0" w:qFormat="1"/>
-    <w:lsdException w:name="Bibliography" w:uiPriority="55"/>
-    <w:lsdException w:name="TOC Heading" w:uiPriority="57" w:qFormat="1"/>
+    <w:lsdException w:name="List Paragraph" w:semiHidden="0" w:uiPriority="82" w:unhideWhenUsed="0" w:qFormat="1"/>
+    <w:lsdException w:name="Quote" w:semiHidden="0" w:uiPriority="65" w:unhideWhenUsed="0" w:qFormat="1"/>
+    <w:lsdException w:name="Intense Quote" w:semiHidden="0" w:uiPriority="72" w:unhideWhenUsed="0" w:qFormat="1"/>
+    <w:lsdException w:name="Medium List 2 Accent 1" w:semiHidden="0" w:uiPriority="258" w:unhideWhenUsed="0"/>
+    <w:lsdException w:name="Medium Grid 1 Accent 1" w:semiHidden="0" w:uiPriority="259" w:unhideWhenUsed="0"/>
+    <w:lsdException w:name="Medium Grid 2 Accent 1" w:semiHidden="0" w:uiPriority="260" w:unhideWhenUsed="0"/>
+    <w:lsdException w:name="Medium Grid 3 Accent 1" w:semiHidden="0" w:uiPriority="261" w:unhideWhenUsed="0"/>
+    <w:lsdException w:name="Dark List Accent 1" w:semiHidden="0" w:uiPriority="274" w:unhideWhenUsed="0"/>
+    <w:lsdException w:name="Colorful Shading Accent 1" w:semiHidden="0" w:uiPriority="275" w:unhideWhenUsed="0"/>
+    <w:lsdException w:name="Colorful List Accent 1" w:semiHidden="0" w:uiPriority="276" w:unhideWhenUsed="0"/>
+    <w:lsdException w:name="Colorful Grid Accent 1" w:semiHidden="0" w:uiPriority="277" w:unhideWhenUsed="0"/>
+    <w:lsdException w:name="Light Shading Accent 2" w:semiHidden="0" w:uiPriority="150" w:unhideWhenUsed="0"/>
+    <w:lsdException w:name="Light List Accent 2" w:semiHidden="0" w:uiPriority="151" w:unhideWhenUsed="0"/>
+    <w:lsdException w:name="Light Grid Accent 2" w:semiHidden="0" w:uiPriority="152" w:unhideWhenUsed="0"/>
+    <w:lsdException w:name="Medium Shading 1 Accent 2" w:semiHidden="0" w:uiPriority="153" w:unhideWhenUsed="0"/>
+    <w:lsdException w:name="Medium Shading 2 Accent 2" w:semiHidden="0" w:uiPriority="256" w:unhideWhenUsed="0"/>
+    <w:lsdException w:name="Medium List 1 Accent 2" w:semiHidden="0" w:uiPriority="257" w:unhideWhenUsed="0"/>
+    <w:lsdException w:name="Medium List 2 Accent 2" w:semiHidden="0" w:uiPriority="258" w:unhideWhenUsed="0"/>
+    <w:lsdException w:name="Medium Grid 1 Accent 2" w:semiHidden="0" w:uiPriority="259" w:unhideWhenUsed="0"/>
+    <w:lsdException w:name="Medium Grid 2 Accent 2" w:semiHidden="0" w:uiPriority="260" w:unhideWhenUsed="0"/>
+    <w:lsdException w:name="Medium Grid 3 Accent 2" w:semiHidden="0" w:uiPriority="261" w:unhideWhenUsed="0"/>
+    <w:lsdException w:name="Dark List Accent 2" w:semiHidden="0" w:uiPriority="274" w:unhideWhenUsed="0"/>
+    <w:lsdException w:name="Colorful Shading Accent 2" w:semiHidden="0" w:uiPriority="275" w:unhideWhenUsed="0"/>
+    <w:lsdException w:name="Colorful List Accent 2" w:semiHidden="0" w:uiPriority="276" w:unhideWhenUsed="0"/>
+    <w:lsdException w:name="Colorful Grid Accent 2" w:semiHidden="0" w:uiPriority="277" w:unhideWhenUsed="0"/>
+    <w:lsdException w:name="Light Shading Accent 3" w:semiHidden="0" w:uiPriority="150" w:unhideWhenUsed="0"/>
+    <w:lsdException w:name="Light List Accent 3" w:semiHidden="0" w:uiPriority="151" w:unhideWhenUsed="0"/>
+    <w:lsdException w:name="Light Grid Accent 3" w:semiHidden="0" w:uiPriority="152" w:unhideWhenUsed="0"/>
+    <w:lsdException w:name="Medium Shading 1 Accent 3" w:semiHidden="0" w:uiPriority="153" w:unhideWhenUsed="0"/>
+    <w:lsdException w:name="Medium Shading 2 Accent 3" w:semiHidden="0" w:uiPriority="256" w:unhideWhenUsed="0"/>
+    <w:lsdException w:name="Medium List 1 Accent 3" w:semiHidden="0" w:uiPriority="257" w:unhideWhenUsed="0"/>
+    <w:lsdException w:name="Medium List 2 Accent 3" w:semiHidden="0" w:uiPriority="258" w:unhideWhenUsed="0"/>
+    <w:lsdException w:name="Medium Grid 1 Accent 3" w:semiHidden="0" w:uiPriority="259" w:unhideWhenUsed="0"/>
+    <w:lsdException w:name="Medium Grid 2 Accent 3" w:semiHidden="0" w:uiPriority="260" w:unhideWhenUsed="0"/>
+    <w:lsdException w:name="Medium Grid 3 Accent 3" w:semiHidden="0" w:uiPriority="261" w:unhideWhenUsed="0"/>
+    <w:lsdException w:name="Dark List Accent 3" w:semiHidden="0" w:uiPriority="274" w:unhideWhenUsed="0"/>
+    <w:lsdException w:name="Colorful Shading Accent 3" w:semiHidden="0" w:uiPriority="275" w:unhideWhenUsed="0"/>
+    <w:lsdException w:name="Colorful List Accent 3" w:semiHidden="0" w:uiPriority="276" w:unhideWhenUsed="0"/>
+    <w:lsdException w:name="Colorful Grid Accent 3" w:semiHidden="0" w:uiPriority="277" w:unhideWhenUsed="0"/>
+    <w:lsdException w:name="Light Shading Accent 4" w:semiHidden="0" w:uiPriority="150" w:unhideWhenUsed="0"/>
+    <w:lsdException w:name="Light List Accent 4" w:semiHidden="0" w:uiPriority="151" w:unhideWhenUsed="0"/>
+    <w:lsdException w:name="Light Grid Accent 4" w:semiHidden="0" w:uiPriority="152" w:unhideWhenUsed="0"/>
+    <w:lsdException w:name="Medium Shading 1 Accent 4" w:semiHidden="0" w:uiPriority="153" w:unhideWhenUsed="0"/>
+    <w:lsdException w:name="Medium Shading 2 Accent 4" w:semiHidden="0" w:uiPriority="256" w:unhideWhenUsed="0"/>
+    <w:lsdException w:name="Medium List 1 Accent 4" w:semiHidden="0" w:uiPriority="257" w:unhideWhenUsed="0"/>
+    <w:lsdException w:name="Medium List 2 Accent 4" w:semiHidden="0" w:uiPriority="258" w:unhideWhenUsed="0"/>
+    <w:lsdException w:name="Medium Grid 1 Accent 4" w:semiHidden="0" w:uiPriority="259" w:unhideWhenUsed="0"/>
+    <w:lsdException w:name="Medium Grid 2 Accent 4" w:semiHidden="0" w:uiPriority="260" w:unhideWhenUsed="0"/>
+    <w:lsdException w:name="Medium Grid 3 Accent 4" w:semiHidden="0" w:uiPriority="261" w:unhideWhenUsed="0"/>
+    <w:lsdException w:name="Dark List Accent 4" w:semiHidden="0" w:uiPriority="274" w:unhideWhenUsed="0"/>
+    <w:lsdException w:name="Colorful Shading Accent 4" w:semiHidden="0" w:uiPriority="275" w:unhideWhenUsed="0"/>
+    <w:lsdException w:name="Colorful List Accent 4" w:semiHidden="0" w:uiPriority="276" w:unhideWhenUsed="0"/>
+    <w:lsdException w:name="Colorful Grid Accent 4" w:semiHidden="0" w:uiPriority="277" w:unhideWhenUsed="0"/>
+    <w:lsdException w:name="Light Shading Accent 5" w:semiHidden="0" w:uiPriority="150" w:unhideWhenUsed="0"/>
+    <w:lsdException w:name="Light List Accent 5" w:semiHidden="0" w:uiPriority="151" w:unhideWhenUsed="0"/>
+    <w:lsdException w:name="Light Grid Accent 5" w:semiHidden="0" w:uiPriority="152" w:unhideWhenUsed="0"/>
+    <w:lsdException w:name="Medium Shading 1 Accent 5" w:semiHidden="0" w:uiPriority="153" w:unhideWhenUsed="0"/>
+    <w:lsdException w:name="Medium Shading 2 Accent 5" w:semiHidden="0" w:uiPriority="256" w:unhideWhenUsed="0"/>
+    <w:lsdException w:name="Medium List 1 Accent 5" w:semiHidden="0" w:uiPriority="257" w:unhideWhenUsed="0"/>
+    <w:lsdException w:name="Medium List 2 Accent 5" w:semiHidden="0" w:uiPriority="258" w:unhideWhenUsed="0"/>
+    <w:lsdException w:name="Medium Grid 1 Accent 5" w:semiHidden="0" w:uiPriority="259" w:unhideWhenUsed="0"/>
+    <w:lsdException w:name="Medium Grid 2 Accent 5" w:semiHidden="0" w:uiPriority="260" w:unhideWhenUsed="0"/>
+    <w:lsdException w:name="Medium Grid 3 Accent 5" w:semiHidden="0" w:uiPriority="261" w:unhideWhenUsed="0"/>
+    <w:lsdException w:name="Dark List Accent 5" w:semiHidden="0" w:uiPriority="274" w:unhideWhenUsed="0"/>
+    <w:lsdException w:name="Colorful Shading Accent 5" w:semiHidden="0" w:uiPriority="275" w:unhideWhenUsed="0"/>
+    <w:lsdException w:name="Colorful List Accent 5" w:semiHidden="0" w:uiPriority="276" w:unhideWhenUsed="0"/>
+    <w:lsdException w:name="Colorful Grid Accent 5" w:semiHidden="0" w:uiPriority="277" w:unhideWhenUsed="0"/>
+    <w:lsdException w:name="Light Shading Accent 6" w:semiHidden="0" w:uiPriority="150" w:unhideWhenUsed="0"/>
+    <w:lsdException w:name="Light List Accent 6" w:semiHidden="0" w:uiPriority="151" w:unhideWhenUsed="0"/>
+    <w:lsdException w:name="Light Grid Accent 6" w:semiHidden="0" w:uiPriority="152" w:unhideWhenUsed="0"/>
+    <w:lsdException w:name="Medium Shading 1 Accent 6" w:semiHidden="0" w:uiPriority="153" w:unhideWhenUsed="0"/>
+    <w:lsdException w:name="Medium Shading 2 Accent 6" w:semiHidden="0" w:uiPriority="256" w:unhideWhenUsed="0"/>
+    <w:lsdException w:name="Medium List 1 Accent 6" w:semiHidden="0" w:uiPriority="257" w:unhideWhenUsed="0"/>
+    <w:lsdException w:name="Medium List 2 Accent 6" w:semiHidden="0" w:uiPriority="258" w:unhideWhenUsed="0"/>
+    <w:lsdException w:name="Medium Grid 1 Accent 6" w:semiHidden="0" w:uiPriority="259" w:unhideWhenUsed="0"/>
+    <w:lsdException w:name="Medium Grid 2 Accent 6" w:semiHidden="0" w:uiPriority="260" w:unhideWhenUsed="0"/>
+    <w:lsdException w:name="Medium Grid 3 Accent 6" w:semiHidden="0" w:uiPriority="261" w:unhideWhenUsed="0"/>
+    <w:lsdException w:name="Dark List Accent 6" w:semiHidden="0" w:uiPriority="274" w:unhideWhenUsed="0"/>
+    <w:lsdException w:name="Colorful Shading Accent 6" w:semiHidden="0" w:uiPriority="275" w:unhideWhenUsed="0"/>
+    <w:lsdException w:name="Colorful List Accent 6" w:semiHidden="0" w:uiPriority="276" w:unhideWhenUsed="0"/>
+    <w:lsdException w:name="Colorful Grid Accent 6" w:semiHidden="0" w:uiPriority="277" w:unhideWhenUsed="0"/>
+    <w:lsdException w:name="Subtle Emphasis" w:semiHidden="0" w:uiPriority="37" w:unhideWhenUsed="0" w:qFormat="1"/>
+    <w:lsdException w:name="Intense Emphasis" w:semiHidden="0" w:uiPriority="51" w:unhideWhenUsed="0" w:qFormat="1"/>
+    <w:lsdException w:name="Subtle Reference" w:semiHidden="0" w:uiPriority="73" w:unhideWhenUsed="0" w:qFormat="1"/>
+    <w:lsdException w:name="Intense Reference" w:semiHidden="0" w:uiPriority="80" w:unhideWhenUsed="0" w:qFormat="1"/>
+    <w:lsdException w:name="Book Title" w:semiHidden="0" w:uiPriority="81" w:unhideWhenUsed="0" w:qFormat="1"/>
+    <w:lsdException w:name="Bibliography" w:uiPriority="85"/>
+    <w:lsdException w:name="TOC Heading" w:uiPriority="87" w:qFormat="1"/>
   </w:latentStyles>
   <w:style w:type="paragraph" w:default="1" w:styleId="Normal">
     <w:name w:val="Normal"/>

</xml_diff>